<commit_message>
出图从 R 改为 Python：新增 s04_figures.py，删除 s04_figures.R
- s04_figures.py：matplotlib 出同样的 11 张图（编号、尺寸、配色不变），宋体五号 + Times New Roman 五号按 C:\Windows\Fonts 路径加载，缺字体时退到替代字体并打印警告
- s00_env.py 改查 matplotlib，不再查 Rscript；run_all.bat 第四步改为 python s04_figures.py；requirements.txt 加 matplotlib
- figures/ 与 logs/s00、s04 用 Python 版重新生成
- PPT、讲稿、README、移交文档中的 R 相关表述同步改掉；移交文档第 7 节"出图 R"规范按用户要求改为 Python，第 10 节记录

Co-Authored-By: Claude Fable 5.1 <noreply@anthropic.com>
Claude-Session: https://claude.ai/code/session_01RmLkAgSqChk5G9i4XLoDT8
</commit_message>
<xml_diff>
--- a/RUL_censored_conformal_handover/02_docs/讲稿_第二次课.docx
+++ b/RUL_censored_conformal_handover/02_docs/讲稿_第二次课.docx
@@ -147,7 +147,7 @@
     </w:p>
     <w:p>
       <w:r>
-        <w:t>【念】数据还是 C-MAPSS，只用 FD001，最简单的子集。删失是人工造的，这句话今天会反复说，论文里每张图注都要写。</w:t>
+        <w:t>【念】数据还是 C-MAPSS，只用 FD001，最简单的子集。全部用 Python，管线和出图都是。删失是人工造的，这句话今天会反复说，论文里每张图注都要写。</w:t>
       </w:r>
     </w:p>
     <w:p>
@@ -978,7 +978,7 @@
     </w:p>
     <w:p>
       <w:r>
-        <w:t>【念】s00_env.py，环境自检。打印 Python 与 numpy、pandas、scikit-learn 版本，Rscript 是否在 PATH，宋体与 Times New Roman 字体文件是否存在，FD001 三个文件是否齐全。验收：三个包有版本号，Rscript 找得到，两个字体都"有"。</w:t>
+        <w:t>【念】s00_env.py，环境自检。打印 Python 与 numpy、pandas、scikit-learn、matplotlib 版本，宋体与 Times New Roman 字体文件是否存在，FD001 三个文件是否齐全。验收：四个包有版本号，两个字体都"有"。</w:t>
       </w:r>
     </w:p>
     <w:p>
@@ -998,7 +998,7 @@
     </w:p>
     <w:p>
       <w:r>
-        <w:t>【念】s04_figures.R，出图。读 results/ 的 CSV 出 11 张图，宋体五号，Times New Roman 五号，PNG 与 PDF 各一份。验收：22 个文件；日志无"回退到系统字体"；F07 到 F09 目视无乱码。</w:t>
+        <w:t>【念】s04_figures.py，出图。matplotlib 读 results/ 的 CSV 出 11 张图，宋体五号，Times New Roman 五号，按 C:\Windows\Fonts 的文件路径加载，PNG 与 PDF 各一份。验收：22 个文件；日志无"回退到替代字体"；F07 到 F09 目视无乱码。</w:t>
       </w:r>
     </w:p>
     <w:p>
@@ -1021,7 +1021,7 @@
     </w:p>
     <w:p>
       <w:r>
-        <w:t>【念】s04 生成，只出这 11 张，不自行加图。F01 失效循环数分布，F02 传感器退化轨迹，数据描述用。F03 删失时间线，第 4 页的图用真数据画。F04 样本量核算随 c0，第 8 页的表画成图。F05 权重随 t，第 5 页的表画成图。F06 基线分段覆盖，第 6 页两方案在无删失时的差。</w:t>
+        <w:t>【念】s04_figures.py 用 matplotlib 生成，只出这 11 张，不自行加图。F01 失效循环数分布，F02 传感器退化轨迹，数据描述用。F03 删失时间线，第 4 页的图用真数据画。F04 样本量核算随 c0，第 8 页的表画成图。F05 权重随 t，第 5 页的表画成图。F06 基线分段覆盖，第 6 页两方案在无删失时的差。</w:t>
       </w:r>
     </w:p>
     <w:p>
@@ -1049,7 +1049,7 @@
     </w:p>
     <w:p>
       <w:r>
-        <w:t>【念】环境：Python 3.11，numpy 2.4，pandas 3.0，scikit-learn 1.9，R 4.3.3。五个脚本全部退出码 0。</w:t>
+        <w:t>【念】环境：Python 3.11，numpy 2.4，pandas 3.0，scikit-learn 1.9，matplotlib 3.11。五个脚本全部退出码 0。</w:t>
       </w:r>
     </w:p>
     <w:p>
@@ -1346,7 +1346,7 @@
     </w:p>
     <w:p>
       <w:r>
-        <w:t>【念】作业一：五个脚本跑通，四个 Python 一个 R，控制台输出和图贴到群里，按移交文档第 9 节的顺序。跑不通的贴报错，不要自己改代码。</w:t>
+        <w:t>【念】作业一：五个 Python 脚本跑通，控制台输出和图贴到群里，按移交文档第 9 节的顺序。跑不通的贴报错，不要自己改代码。</w:t>
       </w:r>
     </w:p>
     <w:p>
@@ -1488,7 +1488,7 @@
         <w:pStyle w:val="ListBullet"/>
       </w:pPr>
       <w:r>
-        <w:t>图是 Linux 预览版（替代字体）。论文用图在 Windows 上重跑 s04，宋体五号加 Times New Roman 五号。</w:t>
+        <w:t>图是 Linux 预览版（替代字体）。论文用图在 Windows 上重跑 s04_figures.py，宋体五号加 Times New Roman 五号。</w:t>
       </w:r>
     </w:p>
     <w:p>

</xml_diff>